<commit_message>
feat: implement graph visualization and concept explorer
</commit_message>
<xml_diff>
--- a/SDE/DevBrain.docx
+++ b/SDE/DevBrain.docx
@@ -15,6 +15,7 @@
           <w:szCs w:val="48"/>
         </w:rPr>
       </w:pPr>
+      <w:bookmarkStart w:id="0" w:name="_GoBack"/>
       <w:r>
         <w:rPr>
           <w:rFonts w:ascii="Times New Roman" w:eastAsia="Times New Roman" w:hAnsi="Times New Roman" w:cs="Times New Roman"/>
@@ -127,7 +128,23 @@
           <w:sz w:val="16"/>
           <w:szCs w:val="24"/>
         </w:rPr>
-        <w:t xml:space="preserve"> 2 Developers</w:t>
+        <w:t xml:space="preserve"> </w:t>
+      </w:r>
+      <w:r>
+        <w:rPr>
+          <w:rFonts w:ascii="Times New Roman" w:eastAsia="Times New Roman" w:hAnsi="Times New Roman" w:cs="Times New Roman"/>
+          <w:sz w:val="16"/>
+          <w:szCs w:val="24"/>
+        </w:rPr>
+        <w:t>1</w:t>
+      </w:r>
+      <w:r>
+        <w:rPr>
+          <w:rFonts w:ascii="Times New Roman" w:eastAsia="Times New Roman" w:hAnsi="Times New Roman" w:cs="Times New Roman"/>
+          <w:sz w:val="16"/>
+          <w:szCs w:val="24"/>
+        </w:rPr>
+        <w:t xml:space="preserve"> Developers</w:t>
       </w:r>
       <w:r>
         <w:rPr>
@@ -172,7 +189,7 @@
           <w:szCs w:val="24"/>
         </w:rPr>
         <w:pict>
-          <v:rect id="_x0000_i1117" style="width:0;height:1.5pt" o:hralign="center" o:hrstd="t" o:hr="t" fillcolor="#a0a0a0" stroked="f"/>
+          <v:rect id="_x0000_i1025" style="width:0;height:1.5pt" o:hralign="center" o:hrstd="t" o:hr="t" fillcolor="#a0a0a0" stroked="f"/>
         </w:pict>
       </w:r>
     </w:p>
@@ -343,7 +360,7 @@
           <w:szCs w:val="24"/>
         </w:rPr>
         <w:pict>
-          <v:rect id="_x0000_i1118" style="width:0;height:1.5pt" o:hralign="center" o:hrstd="t" o:hr="t" fillcolor="#a0a0a0" stroked="f"/>
+          <v:rect id="_x0000_i1026" style="width:0;height:1.5pt" o:hralign="center" o:hrstd="t" o:hr="t" fillcolor="#a0a0a0" stroked="f"/>
         </w:pict>
       </w:r>
     </w:p>
@@ -1014,7 +1031,7 @@
           <w:szCs w:val="24"/>
         </w:rPr>
         <w:pict>
-          <v:rect id="_x0000_i1119" style="width:0;height:1.5pt" o:hralign="center" o:hrstd="t" o:hr="t" fillcolor="#a0a0a0" stroked="f"/>
+          <v:rect id="_x0000_i1027" style="width:0;height:1.5pt" o:hralign="center" o:hrstd="t" o:hr="t" fillcolor="#a0a0a0" stroked="f"/>
         </w:pict>
       </w:r>
     </w:p>
@@ -1077,7 +1094,7 @@
           <w:szCs w:val="24"/>
         </w:rPr>
         <w:pict>
-          <v:rect id="_x0000_i1120" style="width:0;height:1.5pt" o:hralign="center" o:hrstd="t" o:hr="t" fillcolor="#a0a0a0" stroked="f"/>
+          <v:rect id="_x0000_i1028" style="width:0;height:1.5pt" o:hralign="center" o:hrstd="t" o:hr="t" fillcolor="#a0a0a0" stroked="f"/>
         </w:pict>
       </w:r>
     </w:p>
@@ -1296,7 +1313,7 @@
           <w:szCs w:val="24"/>
         </w:rPr>
         <w:pict>
-          <v:rect id="_x0000_i1121" style="width:0;height:1.5pt" o:hralign="center" o:hrstd="t" o:hr="t" fillcolor="#a0a0a0" stroked="f"/>
+          <v:rect id="_x0000_i1029" style="width:0;height:1.5pt" o:hralign="center" o:hrstd="t" o:hr="t" fillcolor="#a0a0a0" stroked="f"/>
         </w:pict>
       </w:r>
     </w:p>
@@ -1475,7 +1492,7 @@
           <w:szCs w:val="24"/>
         </w:rPr>
         <w:pict>
-          <v:rect id="_x0000_i1122" style="width:0;height:1.5pt" o:hralign="center" o:hrstd="t" o:hr="t" fillcolor="#a0a0a0" stroked="f"/>
+          <v:rect id="_x0000_i1030" style="width:0;height:1.5pt" o:hralign="center" o:hrstd="t" o:hr="t" fillcolor="#a0a0a0" stroked="f"/>
         </w:pict>
       </w:r>
     </w:p>
@@ -1654,7 +1671,7 @@
           <w:szCs w:val="24"/>
         </w:rPr>
         <w:pict>
-          <v:rect id="_x0000_i1123" style="width:0;height:1.5pt" o:hralign="center" o:hrstd="t" o:hr="t" fillcolor="#a0a0a0" stroked="f"/>
+          <v:rect id="_x0000_i1031" style="width:0;height:1.5pt" o:hralign="center" o:hrstd="t" o:hr="t" fillcolor="#a0a0a0" stroked="f"/>
         </w:pict>
       </w:r>
     </w:p>
@@ -1785,7 +1802,7 @@
           <w:szCs w:val="24"/>
         </w:rPr>
         <w:pict>
-          <v:rect id="_x0000_i1124" style="width:0;height:1.5pt" o:hralign="center" o:hrstd="t" o:hr="t" fillcolor="#a0a0a0" stroked="f"/>
+          <v:rect id="_x0000_i1032" style="width:0;height:1.5pt" o:hralign="center" o:hrstd="t" o:hr="t" fillcolor="#a0a0a0" stroked="f"/>
         </w:pict>
       </w:r>
     </w:p>
@@ -1848,7 +1865,7 @@
           <w:szCs w:val="24"/>
         </w:rPr>
         <w:pict>
-          <v:rect id="_x0000_i1125" style="width:0;height:1.5pt" o:hralign="center" o:hrstd="t" o:hr="t" fillcolor="#a0a0a0" stroked="f"/>
+          <v:rect id="_x0000_i1033" style="width:0;height:1.5pt" o:hralign="center" o:hrstd="t" o:hr="t" fillcolor="#a0a0a0" stroked="f"/>
         </w:pict>
       </w:r>
     </w:p>
@@ -1979,7 +1996,7 @@
           <w:szCs w:val="24"/>
         </w:rPr>
         <w:pict>
-          <v:rect id="_x0000_i1126" style="width:0;height:1.5pt" o:hralign="center" o:hrstd="t" o:hr="t" fillcolor="#a0a0a0" stroked="f"/>
+          <v:rect id="_x0000_i1034" style="width:0;height:1.5pt" o:hralign="center" o:hrstd="t" o:hr="t" fillcolor="#a0a0a0" stroked="f"/>
         </w:pict>
       </w:r>
     </w:p>
@@ -2281,7 +2298,7 @@
           <w:szCs w:val="24"/>
         </w:rPr>
         <w:pict>
-          <v:rect id="_x0000_i1127" style="width:0;height:1.5pt" o:hralign="center" o:hrstd="t" o:hr="t" fillcolor="#a0a0a0" stroked="f"/>
+          <v:rect id="_x0000_i1035" style="width:0;height:1.5pt" o:hralign="center" o:hrstd="t" o:hr="t" fillcolor="#a0a0a0" stroked="f"/>
         </w:pict>
       </w:r>
     </w:p>
@@ -2485,7 +2502,7 @@
           <w:szCs w:val="24"/>
         </w:rPr>
         <w:pict>
-          <v:rect id="_x0000_i1128" style="width:0;height:1.5pt" o:hralign="center" o:hrstd="t" o:hr="t" fillcolor="#a0a0a0" stroked="f"/>
+          <v:rect id="_x0000_i1036" style="width:0;height:1.5pt" o:hralign="center" o:hrstd="t" o:hr="t" fillcolor="#a0a0a0" stroked="f"/>
         </w:pict>
       </w:r>
     </w:p>
@@ -2564,7 +2581,7 @@
           <w:szCs w:val="24"/>
         </w:rPr>
         <w:pict>
-          <v:rect id="_x0000_i1129" style="width:0;height:1.5pt" o:hralign="center" o:hrstd="t" o:hr="t" fillcolor="#a0a0a0" stroked="f"/>
+          <v:rect id="_x0000_i1037" style="width:0;height:1.5pt" o:hralign="center" o:hrstd="t" o:hr="t" fillcolor="#a0a0a0" stroked="f"/>
         </w:pict>
       </w:r>
     </w:p>
@@ -2627,7 +2644,7 @@
           <w:szCs w:val="24"/>
         </w:rPr>
         <w:pict>
-          <v:rect id="_x0000_i1130" style="width:0;height:1.5pt" o:hralign="center" o:hrstd="t" o:hr="t" fillcolor="#a0a0a0" stroked="f"/>
+          <v:rect id="_x0000_i1038" style="width:0;height:1.5pt" o:hralign="center" o:hrstd="t" o:hr="t" fillcolor="#a0a0a0" stroked="f"/>
         </w:pict>
       </w:r>
     </w:p>
@@ -2686,7 +2703,7 @@
           <w:szCs w:val="24"/>
         </w:rPr>
         <w:pict>
-          <v:rect id="_x0000_i1131" style="width:0;height:1.5pt" o:hralign="center" o:hrstd="t" o:hr="t" fillcolor="#a0a0a0" stroked="f"/>
+          <v:rect id="_x0000_i1039" style="width:0;height:1.5pt" o:hralign="center" o:hrstd="t" o:hr="t" fillcolor="#a0a0a0" stroked="f"/>
         </w:pict>
       </w:r>
     </w:p>
@@ -2837,7 +2854,7 @@
           <w:szCs w:val="24"/>
         </w:rPr>
         <w:pict>
-          <v:rect id="_x0000_i1132" style="width:0;height:1.5pt" o:hralign="center" o:hrstd="t" o:hr="t" fillcolor="#a0a0a0" stroked="f"/>
+          <v:rect id="_x0000_i1040" style="width:0;height:1.5pt" o:hralign="center" o:hrstd="t" o:hr="t" fillcolor="#a0a0a0" stroked="f"/>
         </w:pict>
       </w:r>
     </w:p>
@@ -2937,7 +2954,7 @@
           <w:szCs w:val="24"/>
         </w:rPr>
         <w:pict>
-          <v:rect id="_x0000_i1133" style="width:0;height:1.5pt" o:hralign="center" o:hrstd="t" o:hr="t" fillcolor="#a0a0a0" stroked="f"/>
+          <v:rect id="_x0000_i1041" style="width:0;height:1.5pt" o:hralign="center" o:hrstd="t" o:hr="t" fillcolor="#a0a0a0" stroked="f"/>
         </w:pict>
       </w:r>
     </w:p>
@@ -2998,7 +3015,7 @@
           <w:szCs w:val="24"/>
         </w:rPr>
         <w:pict>
-          <v:rect id="_x0000_i1134" style="width:0;height:1.5pt" o:hralign="center" o:hrstd="t" o:hr="t" fillcolor="#a0a0a0" stroked="f"/>
+          <v:rect id="_x0000_i1042" style="width:0;height:1.5pt" o:hralign="center" o:hrstd="t" o:hr="t" fillcolor="#a0a0a0" stroked="f"/>
         </w:pict>
       </w:r>
     </w:p>
@@ -3057,7 +3074,7 @@
           <w:szCs w:val="24"/>
         </w:rPr>
         <w:pict>
-          <v:rect id="_x0000_i1135" style="width:0;height:1.5pt" o:hralign="center" o:hrstd="t" o:hr="t" fillcolor="#a0a0a0" stroked="f"/>
+          <v:rect id="_x0000_i1043" style="width:0;height:1.5pt" o:hralign="center" o:hrstd="t" o:hr="t" fillcolor="#a0a0a0" stroked="f"/>
         </w:pict>
       </w:r>
     </w:p>
@@ -3137,7 +3154,7 @@
           <w:szCs w:val="24"/>
         </w:rPr>
         <w:pict>
-          <v:rect id="_x0000_i1136" style="width:0;height:1.5pt" o:hralign="center" o:hrstd="t" o:hr="t" fillcolor="#a0a0a0" stroked="f"/>
+          <v:rect id="_x0000_i1044" style="width:0;height:1.5pt" o:hralign="center" o:hrstd="t" o:hr="t" fillcolor="#a0a0a0" stroked="f"/>
         </w:pict>
       </w:r>
     </w:p>
@@ -3200,7 +3217,7 @@
           <w:szCs w:val="24"/>
         </w:rPr>
         <w:pict>
-          <v:rect id="_x0000_i1137" style="width:0;height:1.5pt" o:hralign="center" o:hrstd="t" o:hr="t" fillcolor="#a0a0a0" stroked="f"/>
+          <v:rect id="_x0000_i1045" style="width:0;height:1.5pt" o:hralign="center" o:hrstd="t" o:hr="t" fillcolor="#a0a0a0" stroked="f"/>
         </w:pict>
       </w:r>
     </w:p>
@@ -3358,7 +3375,7 @@
           <w:szCs w:val="24"/>
         </w:rPr>
         <w:pict>
-          <v:rect id="_x0000_i1138" style="width:0;height:1.5pt" o:hralign="center" o:hrstd="t" o:hr="t" fillcolor="#a0a0a0" stroked="f"/>
+          <v:rect id="_x0000_i1046" style="width:0;height:1.5pt" o:hralign="center" o:hrstd="t" o:hr="t" fillcolor="#a0a0a0" stroked="f"/>
         </w:pict>
       </w:r>
     </w:p>
@@ -3450,7 +3467,7 @@
           <w:szCs w:val="24"/>
         </w:rPr>
         <w:pict>
-          <v:rect id="_x0000_i1139" style="width:0;height:1.5pt" o:hralign="center" o:hrstd="t" o:hr="t" fillcolor="#a0a0a0" stroked="f"/>
+          <v:rect id="_x0000_i1047" style="width:0;height:1.5pt" o:hralign="center" o:hrstd="t" o:hr="t" fillcolor="#a0a0a0" stroked="f"/>
         </w:pict>
       </w:r>
     </w:p>
@@ -3550,7 +3567,7 @@
           <w:szCs w:val="24"/>
         </w:rPr>
         <w:pict>
-          <v:rect id="_x0000_i1140" style="width:0;height:1.5pt" o:hralign="center" o:hrstd="t" o:hr="t" fillcolor="#a0a0a0" stroked="f"/>
+          <v:rect id="_x0000_i1048" style="width:0;height:1.5pt" o:hralign="center" o:hrstd="t" o:hr="t" fillcolor="#a0a0a0" stroked="f"/>
         </w:pict>
       </w:r>
     </w:p>
@@ -3726,7 +3743,7 @@
           <w:szCs w:val="24"/>
         </w:rPr>
         <w:pict>
-          <v:rect id="_x0000_i1141" style="width:0;height:1.5pt" o:hralign="center" o:hrstd="t" o:hr="t" fillcolor="#a0a0a0" stroked="f"/>
+          <v:rect id="_x0000_i1049" style="width:0;height:1.5pt" o:hralign="center" o:hrstd="t" o:hr="t" fillcolor="#a0a0a0" stroked="f"/>
         </w:pict>
       </w:r>
     </w:p>
@@ -3805,7 +3822,7 @@
           <w:szCs w:val="24"/>
         </w:rPr>
         <w:pict>
-          <v:rect id="_x0000_i1142" style="width:0;height:1.5pt" o:hralign="center" o:hrstd="t" o:hr="t" fillcolor="#a0a0a0" stroked="f"/>
+          <v:rect id="_x0000_i1050" style="width:0;height:1.5pt" o:hralign="center" o:hrstd="t" o:hr="t" fillcolor="#a0a0a0" stroked="f"/>
         </w:pict>
       </w:r>
     </w:p>
@@ -3868,7 +3885,7 @@
           <w:szCs w:val="24"/>
         </w:rPr>
         <w:pict>
-          <v:rect id="_x0000_i1143" style="width:0;height:1.5pt" o:hralign="center" o:hrstd="t" o:hr="t" fillcolor="#a0a0a0" stroked="f"/>
+          <v:rect id="_x0000_i1051" style="width:0;height:1.5pt" o:hralign="center" o:hrstd="t" o:hr="t" fillcolor="#a0a0a0" stroked="f"/>
         </w:pict>
       </w:r>
     </w:p>
@@ -3946,7 +3963,7 @@
           <w:szCs w:val="24"/>
         </w:rPr>
         <w:pict>
-          <v:rect id="_x0000_i1144" style="width:0;height:1.5pt" o:hralign="center" o:hrstd="t" o:hr="t" fillcolor="#a0a0a0" stroked="f"/>
+          <v:rect id="_x0000_i1052" style="width:0;height:1.5pt" o:hralign="center" o:hrstd="t" o:hr="t" fillcolor="#a0a0a0" stroked="f"/>
         </w:pict>
       </w:r>
     </w:p>
@@ -4095,7 +4112,7 @@
           <w:szCs w:val="24"/>
         </w:rPr>
         <w:pict>
-          <v:rect id="_x0000_i1145" style="width:0;height:1.5pt" o:hralign="center" o:hrstd="t" o:hr="t" fillcolor="#a0a0a0" stroked="f"/>
+          <v:rect id="_x0000_i1053" style="width:0;height:1.5pt" o:hralign="center" o:hrstd="t" o:hr="t" fillcolor="#a0a0a0" stroked="f"/>
         </w:pict>
       </w:r>
     </w:p>
@@ -4174,7 +4191,7 @@
           <w:szCs w:val="24"/>
         </w:rPr>
         <w:pict>
-          <v:rect id="_x0000_i1146" style="width:0;height:1.5pt" o:hralign="center" o:hrstd="t" o:hr="t" fillcolor="#a0a0a0" stroked="f"/>
+          <v:rect id="_x0000_i1054" style="width:0;height:1.5pt" o:hralign="center" o:hrstd="t" o:hr="t" fillcolor="#a0a0a0" stroked="f"/>
         </w:pict>
       </w:r>
     </w:p>
@@ -4237,7 +4254,7 @@
           <w:szCs w:val="24"/>
         </w:rPr>
         <w:pict>
-          <v:rect id="_x0000_i1147" style="width:0;height:1.5pt" o:hralign="center" o:hrstd="t" o:hr="t" fillcolor="#a0a0a0" stroked="f"/>
+          <v:rect id="_x0000_i1055" style="width:0;height:1.5pt" o:hralign="center" o:hrstd="t" o:hr="t" fillcolor="#a0a0a0" stroked="f"/>
         </w:pict>
       </w:r>
     </w:p>
@@ -4314,7 +4331,7 @@
           <w:szCs w:val="24"/>
         </w:rPr>
         <w:pict>
-          <v:rect id="_x0000_i1148" style="width:0;height:1.5pt" o:hralign="center" o:hrstd="t" o:hr="t" fillcolor="#a0a0a0" stroked="f"/>
+          <v:rect id="_x0000_i1056" style="width:0;height:1.5pt" o:hralign="center" o:hrstd="t" o:hr="t" fillcolor="#a0a0a0" stroked="f"/>
         </w:pict>
       </w:r>
     </w:p>
@@ -4481,7 +4498,7 @@
           <w:szCs w:val="24"/>
         </w:rPr>
         <w:pict>
-          <v:rect id="_x0000_i1149" style="width:0;height:1.5pt" o:hralign="center" o:hrstd="t" o:hr="t" fillcolor="#a0a0a0" stroked="f"/>
+          <v:rect id="_x0000_i1057" style="width:0;height:1.5pt" o:hralign="center" o:hrstd="t" o:hr="t" fillcolor="#a0a0a0" stroked="f"/>
         </w:pict>
       </w:r>
     </w:p>
@@ -4540,7 +4557,7 @@
           <w:szCs w:val="24"/>
         </w:rPr>
         <w:pict>
-          <v:rect id="_x0000_i1150" style="width:0;height:1.5pt" o:hralign="center" o:hrstd="t" o:hr="t" fillcolor="#a0a0a0" stroked="f"/>
+          <v:rect id="_x0000_i1058" style="width:0;height:1.5pt" o:hralign="center" o:hrstd="t" o:hr="t" fillcolor="#a0a0a0" stroked="f"/>
         </w:pict>
       </w:r>
     </w:p>
@@ -4619,7 +4636,7 @@
           <w:szCs w:val="24"/>
         </w:rPr>
         <w:pict>
-          <v:rect id="_x0000_i1151" style="width:0;height:1.5pt" o:hralign="center" o:hrstd="t" o:hr="t" fillcolor="#a0a0a0" stroked="f"/>
+          <v:rect id="_x0000_i1059" style="width:0;height:1.5pt" o:hralign="center" o:hrstd="t" o:hr="t" fillcolor="#a0a0a0" stroked="f"/>
         </w:pict>
       </w:r>
     </w:p>
@@ -4665,7 +4682,7 @@
         </w:rPr>
         <w:lastRenderedPageBreak/>
         <w:pict>
-          <v:rect id="_x0000_i1152" style="width:0;height:1.5pt" o:hralign="center" o:hrstd="t" o:hr="t" fillcolor="#a0a0a0" stroked="f"/>
+          <v:rect id="_x0000_i1060" style="width:0;height:1.5pt" o:hralign="center" o:hrstd="t" o:hr="t" fillcolor="#a0a0a0" stroked="f"/>
         </w:pict>
       </w:r>
     </w:p>
@@ -4765,7 +4782,7 @@
           <w:szCs w:val="24"/>
         </w:rPr>
         <w:pict>
-          <v:rect id="_x0000_i1153" style="width:0;height:1.5pt" o:hralign="center" o:hrstd="t" o:hr="t" fillcolor="#a0a0a0" stroked="f"/>
+          <v:rect id="_x0000_i1061" style="width:0;height:1.5pt" o:hralign="center" o:hrstd="t" o:hr="t" fillcolor="#a0a0a0" stroked="f"/>
         </w:pict>
       </w:r>
     </w:p>
@@ -4844,7 +4861,7 @@
           <w:szCs w:val="24"/>
         </w:rPr>
         <w:pict>
-          <v:rect id="_x0000_i1154" style="width:0;height:1.5pt" o:hralign="center" o:hrstd="t" o:hr="t" fillcolor="#a0a0a0" stroked="f"/>
+          <v:rect id="_x0000_i1062" style="width:0;height:1.5pt" o:hralign="center" o:hrstd="t" o:hr="t" fillcolor="#a0a0a0" stroked="f"/>
         </w:pict>
       </w:r>
     </w:p>
@@ -4941,7 +4958,7 @@
           <w:szCs w:val="24"/>
         </w:rPr>
         <w:pict>
-          <v:rect id="_x0000_i1155" style="width:0;height:1.5pt" o:hralign="center" o:hrstd="t" o:hr="t" fillcolor="#a0a0a0" stroked="f"/>
+          <v:rect id="_x0000_i1063" style="width:0;height:1.5pt" o:hralign="center" o:hrstd="t" o:hr="t" fillcolor="#a0a0a0" stroked="f"/>
         </w:pict>
       </w:r>
     </w:p>
@@ -5038,7 +5055,7 @@
           <w:szCs w:val="24"/>
         </w:rPr>
         <w:pict>
-          <v:rect id="_x0000_i1156" style="width:0;height:1.5pt" o:hralign="center" o:hrstd="t" o:hr="t" fillcolor="#a0a0a0" stroked="f"/>
+          <v:rect id="_x0000_i1064" style="width:0;height:1.5pt" o:hralign="center" o:hrstd="t" o:hr="t" fillcolor="#a0a0a0" stroked="f"/>
         </w:pict>
       </w:r>
     </w:p>
@@ -5135,7 +5152,7 @@
           <w:szCs w:val="24"/>
         </w:rPr>
         <w:pict>
-          <v:rect id="_x0000_i1157" style="width:0;height:1.5pt" o:hralign="center" o:hrstd="t" o:hr="t" fillcolor="#a0a0a0" stroked="f"/>
+          <v:rect id="_x0000_i1065" style="width:0;height:1.5pt" o:hralign="center" o:hrstd="t" o:hr="t" fillcolor="#a0a0a0" stroked="f"/>
         </w:pict>
       </w:r>
     </w:p>
@@ -5180,7 +5197,7 @@
           <w:szCs w:val="24"/>
         </w:rPr>
         <w:pict>
-          <v:rect id="_x0000_i1158" style="width:0;height:1.5pt" o:hralign="center" o:hrstd="t" o:hr="t" fillcolor="#a0a0a0" stroked="f"/>
+          <v:rect id="_x0000_i1066" style="width:0;height:1.5pt" o:hralign="center" o:hrstd="t" o:hr="t" fillcolor="#a0a0a0" stroked="f"/>
         </w:pict>
       </w:r>
     </w:p>
@@ -5309,7 +5326,7 @@
           <w:szCs w:val="24"/>
         </w:rPr>
         <w:pict>
-          <v:rect id="_x0000_i1159" style="width:0;height:1.5pt" o:hralign="center" o:hrstd="t" o:hr="t" fillcolor="#a0a0a0" stroked="f"/>
+          <v:rect id="_x0000_i1067" style="width:0;height:1.5pt" o:hralign="center" o:hrstd="t" o:hr="t" fillcolor="#a0a0a0" stroked="f"/>
         </w:pict>
       </w:r>
     </w:p>
@@ -5458,7 +5475,7 @@
           <w:szCs w:val="24"/>
         </w:rPr>
         <w:pict>
-          <v:rect id="_x0000_i1160" style="width:0;height:1.5pt" o:hralign="center" o:hrstd="t" o:hr="t" fillcolor="#a0a0a0" stroked="f"/>
+          <v:rect id="_x0000_i1068" style="width:0;height:1.5pt" o:hralign="center" o:hrstd="t" o:hr="t" fillcolor="#a0a0a0" stroked="f"/>
         </w:pict>
       </w:r>
     </w:p>
@@ -5563,7 +5580,7 @@
           <w:szCs w:val="24"/>
         </w:rPr>
         <w:pict>
-          <v:rect id="_x0000_i1161" style="width:0;height:1.5pt" o:hralign="center" o:hrstd="t" o:hr="t" fillcolor="#a0a0a0" stroked="f"/>
+          <v:rect id="_x0000_i1069" style="width:0;height:1.5pt" o:hralign="center" o:hrstd="t" o:hr="t" fillcolor="#a0a0a0" stroked="f"/>
         </w:pict>
       </w:r>
     </w:p>
@@ -5739,7 +5756,7 @@
           <w:szCs w:val="24"/>
         </w:rPr>
         <w:pict>
-          <v:rect id="_x0000_i1162" style="width:0;height:1.5pt" o:hralign="center" o:hrstd="t" o:hr="t" fillcolor="#a0a0a0" stroked="f"/>
+          <v:rect id="_x0000_i1070" style="width:0;height:1.5pt" o:hralign="center" o:hrstd="t" o:hr="t" fillcolor="#a0a0a0" stroked="f"/>
         </w:pict>
       </w:r>
     </w:p>
@@ -5763,8 +5780,6 @@
         </w:rPr>
         <w:t>Backend</w:t>
       </w:r>
-      <w:bookmarkStart w:id="0" w:name="_GoBack"/>
-      <w:bookmarkEnd w:id="0"/>
     </w:p>
     <w:p>
       <w:pPr>
@@ -5848,7 +5863,7 @@
           <w:szCs w:val="24"/>
         </w:rPr>
         <w:pict>
-          <v:rect id="_x0000_i1163" style="width:0;height:1.5pt" o:hralign="center" o:hrstd="t" o:hr="t" fillcolor="#a0a0a0" stroked="f"/>
+          <v:rect id="_x0000_i1071" style="width:0;height:1.5pt" o:hralign="center" o:hrstd="t" o:hr="t" fillcolor="#a0a0a0" stroked="f"/>
         </w:pict>
       </w:r>
     </w:p>
@@ -5911,7 +5926,7 @@
           <w:szCs w:val="24"/>
         </w:rPr>
         <w:pict>
-          <v:rect id="_x0000_i1164" style="width:0;height:1.5pt" o:hralign="center" o:hrstd="t" o:hr="t" fillcolor="#a0a0a0" stroked="f"/>
+          <v:rect id="_x0000_i1072" style="width:0;height:1.5pt" o:hralign="center" o:hrstd="t" o:hr="t" fillcolor="#a0a0a0" stroked="f"/>
         </w:pict>
       </w:r>
     </w:p>
@@ -5974,7 +5989,7 @@
           <w:szCs w:val="24"/>
         </w:rPr>
         <w:pict>
-          <v:rect id="_x0000_i1165" style="width:0;height:1.5pt" o:hralign="center" o:hrstd="t" o:hr="t" fillcolor="#a0a0a0" stroked="f"/>
+          <v:rect id="_x0000_i1073" style="width:0;height:1.5pt" o:hralign="center" o:hrstd="t" o:hr="t" fillcolor="#a0a0a0" stroked="f"/>
         </w:pict>
       </w:r>
     </w:p>
@@ -6037,7 +6052,7 @@
           <w:szCs w:val="24"/>
         </w:rPr>
         <w:pict>
-          <v:rect id="_x0000_i1166" style="width:0;height:1.5pt" o:hralign="center" o:hrstd="t" o:hr="t" fillcolor="#a0a0a0" stroked="f"/>
+          <v:rect id="_x0000_i1074" style="width:0;height:1.5pt" o:hralign="center" o:hrstd="t" o:hr="t" fillcolor="#a0a0a0" stroked="f"/>
         </w:pict>
       </w:r>
     </w:p>
@@ -6100,7 +6115,7 @@
           <w:szCs w:val="24"/>
         </w:rPr>
         <w:pict>
-          <v:rect id="_x0000_i1167" style="width:0;height:1.5pt" o:hralign="center" o:hrstd="t" o:hr="t" fillcolor="#a0a0a0" stroked="f"/>
+          <v:rect id="_x0000_i1075" style="width:0;height:1.5pt" o:hralign="center" o:hrstd="t" o:hr="t" fillcolor="#a0a0a0" stroked="f"/>
         </w:pict>
       </w:r>
     </w:p>
@@ -6342,7 +6357,7 @@
           <w:szCs w:val="24"/>
         </w:rPr>
         <w:pict>
-          <v:rect id="_x0000_i1168" style="width:0;height:1.5pt" o:hralign="center" o:hrstd="t" o:hr="t" fillcolor="#a0a0a0" stroked="f"/>
+          <v:rect id="_x0000_i1076" style="width:0;height:1.5pt" o:hralign="center" o:hrstd="t" o:hr="t" fillcolor="#a0a0a0" stroked="f"/>
         </w:pict>
       </w:r>
     </w:p>
@@ -6689,7 +6704,7 @@
           <w:szCs w:val="24"/>
         </w:rPr>
         <w:pict>
-          <v:rect id="_x0000_i1169" style="width:0;height:1.5pt" o:hralign="center" o:hrstd="t" o:hr="t" fillcolor="#a0a0a0" stroked="f"/>
+          <v:rect id="_x0000_i1077" style="width:0;height:1.5pt" o:hralign="center" o:hrstd="t" o:hr="t" fillcolor="#a0a0a0" stroked="f"/>
         </w:pict>
       </w:r>
     </w:p>
@@ -6957,6 +6972,7 @@
         <w:t>Full Stack Development</w:t>
       </w:r>
     </w:p>
+    <w:bookmarkEnd w:id="0"/>
     <w:p>
       <w:pPr>
         <w:rPr>

</xml_diff>